<commit_message>
Docs: Se realizaron las modificaciones correspondientes al SCM04 en el modelo de datos
</commit_message>
<xml_diff>
--- a/03-Elaboración II/02-Modelo de Datos/Modelo de Datos_MetricFlow SQA_CoDevIT.docx
+++ b/03-Elaboración II/02-Modelo de Datos/Modelo de Datos_MetricFlow SQA_CoDevIT.docx
@@ -11015,9 +11015,9 @@
         <w:tblLook w:val="04A0" w:firstRow="1" w:lastRow="0" w:firstColumn="1" w:lastColumn="0" w:noHBand="0" w:noVBand="1"/>
       </w:tblPr>
       <w:tblGrid>
-        <w:gridCol w:w="1197"/>
-        <w:gridCol w:w="2284"/>
-        <w:gridCol w:w="5023"/>
+        <w:gridCol w:w="1159"/>
+        <w:gridCol w:w="2187"/>
+        <w:gridCol w:w="5158"/>
       </w:tblGrid>
       <w:tr>
         <w:trPr>
@@ -11699,8 +11699,24 @@
                 <w:rFonts w:eastAsia="Times New Roman"/>
                 <w:color w:val="000000"/>
               </w:rPr>
-              <w:t>-Tarea </w:t>
-            </w:r>
+              <w:t>-Tarea</w:t>
+            </w:r>
+            <w:r>
+              <w:rPr>
+                <w:rFonts w:eastAsia="Times New Roman"/>
+                <w:color w:val="000000"/>
+              </w:rPr>
+              <w:t>-</w:t>
+            </w:r>
+            <w:proofErr w:type="spellStart"/>
+            <w:r>
+              <w:rPr>
+                <w:rFonts w:eastAsia="Times New Roman"/>
+                <w:color w:val="000000"/>
+              </w:rPr>
+              <w:t>Iteracion</w:t>
+            </w:r>
+            <w:proofErr w:type="spellEnd"/>
           </w:p>
           <w:p>
             <w:pPr>
@@ -11759,16 +11775,28 @@
                 <w:rFonts w:eastAsia="Times New Roman"/>
                 <w:color w:val="000000"/>
               </w:rPr>
-              <w:t>Una métrica se vincula con varias tareas, mientras que, una tarea está vinculada a varias métricas (</w:t>
-            </w:r>
-            <w:r>
-              <w:rPr>
-                <w:rFonts w:eastAsia="Times New Roman"/>
-                <w:b/>
-                <w:bCs/>
-                <w:color w:val="000000"/>
-              </w:rPr>
-              <w:t>N, M</w:t>
+              <w:t>Una métrica se vincula con varias tareas,</w:t>
+            </w:r>
+            <w:r>
+              <w:rPr>
+                <w:rFonts w:eastAsia="Times New Roman"/>
+                <w:color w:val="000000"/>
+              </w:rPr>
+              <w:t xml:space="preserve"> las cuales se vinculan con iteraciones</w:t>
+            </w:r>
+            <w:r>
+              <w:rPr>
+                <w:rFonts w:eastAsia="Times New Roman"/>
+                <w:color w:val="000000"/>
+              </w:rPr>
+              <w:t xml:space="preserve"> mientras que, una tarea está vinculada a varias métricas </w:t>
+            </w:r>
+            <w:r>
+              <w:rPr>
+                <w:rFonts w:eastAsia="Times New Roman"/>
+                <w:color w:val="000000"/>
+              </w:rPr>
+              <w:t>(N:N:N</w:t>
             </w:r>
             <w:r>
               <w:rPr>
@@ -12592,17 +12620,17 @@
       </w:pPr>
       <w:r>
         <w:rPr>
-          <w:rFonts w:eastAsia="Times New Roman"/>
+          <w:rFonts w:ascii="Times New Roman" w:eastAsia="Times New Roman" w:hAnsi="Times New Roman" w:cs="Times New Roman"/>
           <w:noProof/>
-          <w:color w:val="000000"/>
-          <w:bdr w:val="none" w:sz="0" w:space="0" w:color="auto" w:frame="1"/>
+          <w:sz w:val="24"/>
+          <w:szCs w:val="24"/>
         </w:rPr>
         <w:lastRenderedPageBreak/>
         <w:drawing>
-          <wp:inline distT="0" distB="0" distL="0" distR="0" wp14:anchorId="178DA242" wp14:editId="2F968070">
-            <wp:extent cx="5574030" cy="3869690"/>
-            <wp:effectExtent l="0" t="0" r="7620" b="0"/>
-            <wp:docPr id="13" name="Imagen 13"/>
+          <wp:inline distT="0" distB="0" distL="0" distR="0" wp14:anchorId="475BD154" wp14:editId="1D1FBD78">
+            <wp:extent cx="6105585" cy="4236720"/>
+            <wp:effectExtent l="0" t="0" r="9525" b="0"/>
+            <wp:docPr id="21" name="Imagen 21"/>
             <wp:cNvGraphicFramePr>
               <a:graphicFrameLocks xmlns:a="http://schemas.openxmlformats.org/drawingml/2006/main" noChangeAspect="1"/>
             </wp:cNvGraphicFramePr>
@@ -12610,10 +12638,8 @@
               <a:graphicData uri="http://schemas.openxmlformats.org/drawingml/2006/picture">
                 <pic:pic xmlns:pic="http://schemas.openxmlformats.org/drawingml/2006/picture">
                   <pic:nvPicPr>
-                    <pic:cNvPr id="0" name="Picture 13"/>
-                    <pic:cNvPicPr>
-                      <a:picLocks noChangeAspect="1" noChangeArrowheads="1"/>
-                    </pic:cNvPicPr>
+                    <pic:cNvPr id="21" name="Imagen 21"/>
+                    <pic:cNvPicPr/>
                   </pic:nvPicPr>
                   <pic:blipFill>
                     <a:blip r:embed="rId11">
@@ -12623,23 +12649,18 @@
                         </a:ext>
                       </a:extLst>
                     </a:blip>
-                    <a:srcRect/>
                     <a:stretch>
                       <a:fillRect/>
                     </a:stretch>
                   </pic:blipFill>
-                  <pic:spPr bwMode="auto">
+                  <pic:spPr>
                     <a:xfrm>
                       <a:off x="0" y="0"/>
-                      <a:ext cx="5574030" cy="3869690"/>
+                      <a:ext cx="6119087" cy="4246089"/>
                     </a:xfrm>
                     <a:prstGeom prst="rect">
                       <a:avLst/>
                     </a:prstGeom>
-                    <a:noFill/>
-                    <a:ln>
-                      <a:noFill/>
-                    </a:ln>
                   </pic:spPr>
                 </pic:pic>
               </a:graphicData>
@@ -12714,7 +12735,7 @@
         </w:rPr>
         <w:lastRenderedPageBreak/>
         <w:drawing>
-          <wp:inline distT="0" distB="0" distL="0" distR="0" wp14:anchorId="3BCA26F3" wp14:editId="07526CFE">
+          <wp:inline distT="0" distB="0" distL="0" distR="0" wp14:anchorId="3BCA26F3" wp14:editId="528464A5">
             <wp:extent cx="3606165" cy="4791710"/>
             <wp:effectExtent l="0" t="0" r="0" b="8890"/>
             <wp:docPr id="14" name="Imagen 14"/>
@@ -14322,7 +14343,25 @@
           <w:bCs/>
           <w:color w:val="4F81BD"/>
         </w:rPr>
-        <w:t>METRICA-TAREA (N:M):</w:t>
+        <w:t>METRICA-TAREA</w:t>
+      </w:r>
+      <w:r>
+        <w:rPr>
+          <w:rFonts w:eastAsia="Times New Roman"/>
+          <w:b/>
+          <w:bCs/>
+          <w:color w:val="4F81BD"/>
+        </w:rPr>
+        <w:t>-ITERACION</w:t>
+      </w:r>
+      <w:r>
+        <w:rPr>
+          <w:rFonts w:eastAsia="Times New Roman"/>
+          <w:b/>
+          <w:bCs/>
+          <w:color w:val="4F81BD"/>
+        </w:rPr>
+        <w:t xml:space="preserve"> (N:M):</w:t>
       </w:r>
     </w:p>
     <w:p>
@@ -14394,6 +14433,53 @@
         <w:ind w:left="0"/>
         <w:jc w:val="both"/>
         <w:rPr>
+          <w:rFonts w:eastAsia="Times New Roman"/>
+          <w:color w:val="000000"/>
+        </w:rPr>
+      </w:pPr>
+      <w:r>
+        <w:rPr>
+          <w:rFonts w:eastAsia="Times New Roman"/>
+          <w:color w:val="000000"/>
+        </w:rPr>
+        <w:lastRenderedPageBreak/>
+        <w:t>TAREA (</w:t>
+      </w:r>
+      <w:proofErr w:type="spellStart"/>
+      <w:r>
+        <w:rPr>
+          <w:rFonts w:eastAsia="Times New Roman"/>
+          <w:b/>
+          <w:bCs/>
+          <w:color w:val="000000"/>
+          <w:u w:val="single"/>
+        </w:rPr>
+        <w:t>id_tarea</w:t>
+      </w:r>
+      <w:proofErr w:type="spellEnd"/>
+      <w:r>
+        <w:rPr>
+          <w:rFonts w:eastAsia="Times New Roman"/>
+          <w:b/>
+          <w:bCs/>
+          <w:color w:val="000000"/>
+        </w:rPr>
+        <w:t>(PK)</w:t>
+      </w:r>
+      <w:r>
+        <w:rPr>
+          <w:rFonts w:eastAsia="Times New Roman"/>
+          <w:color w:val="000000"/>
+        </w:rPr>
+        <w:t>, nombre).</w:t>
+      </w:r>
+    </w:p>
+    <w:p>
+      <w:pPr>
+        <w:spacing w:line="240" w:lineRule="auto"/>
+        <w:ind w:left="0"/>
+        <w:jc w:val="both"/>
+        <w:rPr>
           <w:rFonts w:ascii="Times New Roman" w:eastAsia="Times New Roman" w:hAnsi="Times New Roman" w:cs="Times New Roman"/>
           <w:sz w:val="24"/>
           <w:szCs w:val="24"/>
@@ -14404,8 +14490,7 @@
           <w:rFonts w:eastAsia="Times New Roman"/>
           <w:color w:val="000000"/>
         </w:rPr>
-        <w:lastRenderedPageBreak/>
-        <w:t>TAREA (</w:t>
+        <w:t>ITERACION (</w:t>
       </w:r>
       <w:proofErr w:type="spellStart"/>
       <w:r>
@@ -14416,7 +14501,7 @@
           <w:color w:val="000000"/>
           <w:u w:val="single"/>
         </w:rPr>
-        <w:t>id_tarea</w:t>
+        <w:t>id_iteracion</w:t>
       </w:r>
       <w:proofErr w:type="spellEnd"/>
       <w:r>
@@ -14433,7 +14518,82 @@
           <w:rFonts w:eastAsia="Times New Roman"/>
           <w:color w:val="000000"/>
         </w:rPr>
-        <w:t>, nombre).</w:t>
+        <w:t xml:space="preserve">, </w:t>
+      </w:r>
+      <w:proofErr w:type="spellStart"/>
+      <w:r>
+        <w:rPr>
+          <w:rFonts w:eastAsia="Times New Roman"/>
+          <w:color w:val="000000"/>
+        </w:rPr>
+        <w:t>numero_iteracion</w:t>
+      </w:r>
+      <w:proofErr w:type="spellEnd"/>
+      <w:r>
+        <w:rPr>
+          <w:rFonts w:eastAsia="Times New Roman"/>
+          <w:color w:val="000000"/>
+        </w:rPr>
+        <w:t xml:space="preserve">, </w:t>
+      </w:r>
+      <w:proofErr w:type="spellStart"/>
+      <w:r>
+        <w:rPr>
+          <w:rFonts w:eastAsia="Times New Roman"/>
+          <w:color w:val="000000"/>
+        </w:rPr>
+        <w:t>fecha_fin</w:t>
+      </w:r>
+      <w:proofErr w:type="spellEnd"/>
+      <w:r>
+        <w:rPr>
+          <w:rFonts w:eastAsia="Times New Roman"/>
+          <w:color w:val="000000"/>
+        </w:rPr>
+        <w:t xml:space="preserve">, </w:t>
+      </w:r>
+      <w:proofErr w:type="spellStart"/>
+      <w:r>
+        <w:rPr>
+          <w:rFonts w:eastAsia="Times New Roman"/>
+          <w:color w:val="000000"/>
+        </w:rPr>
+        <w:t>fecha_inicio</w:t>
+      </w:r>
+      <w:proofErr w:type="spellEnd"/>
+      <w:r>
+        <w:rPr>
+          <w:rFonts w:eastAsia="Times New Roman"/>
+          <w:color w:val="000000"/>
+        </w:rPr>
+        <w:t xml:space="preserve">, objetivo, </w:t>
+      </w:r>
+      <w:proofErr w:type="spellStart"/>
+      <w:r>
+        <w:rPr>
+          <w:rFonts w:eastAsia="Times New Roman"/>
+          <w:i/>
+          <w:iCs/>
+          <w:color w:val="073763"/>
+        </w:rPr>
+        <w:t>id_fase</w:t>
+      </w:r>
+      <w:proofErr w:type="spellEnd"/>
+      <w:r>
+        <w:rPr>
+          <w:rFonts w:eastAsia="Times New Roman"/>
+          <w:i/>
+          <w:iCs/>
+          <w:color w:val="073763"/>
+        </w:rPr>
+        <w:t xml:space="preserve"> (FK)</w:t>
+      </w:r>
+      <w:r>
+        <w:rPr>
+          <w:rFonts w:eastAsia="Times New Roman"/>
+          <w:color w:val="000000"/>
+        </w:rPr>
+        <w:t>)</w:t>
       </w:r>
     </w:p>
     <w:p>
@@ -14509,261 +14669,6 @@
       <w:r>
         <w:rPr>
           <w:rFonts w:eastAsia="Times New Roman"/>
-          <w:i/>
-          <w:iCs/>
-          <w:color w:val="000000"/>
-        </w:rPr>
-        <w:t>(</w:t>
-      </w:r>
-      <w:r>
-        <w:rPr>
-          <w:rFonts w:eastAsia="Times New Roman"/>
-          <w:b/>
-          <w:bCs/>
-          <w:i/>
-          <w:iCs/>
-          <w:color w:val="000000"/>
-        </w:rPr>
-        <w:t>PK)</w:t>
-      </w:r>
-      <w:r>
-        <w:rPr>
-          <w:rFonts w:eastAsia="Times New Roman"/>
-          <w:i/>
-          <w:iCs/>
-          <w:color w:val="000000"/>
-        </w:rPr>
-        <w:t xml:space="preserve">, </w:t>
-      </w:r>
-      <w:proofErr w:type="spellStart"/>
-      <w:r>
-        <w:rPr>
-          <w:rFonts w:eastAsia="Times New Roman"/>
-          <w:color w:val="000000"/>
-        </w:rPr>
-        <w:t>valor_planificado</w:t>
-      </w:r>
-      <w:proofErr w:type="spellEnd"/>
-      <w:r>
-        <w:rPr>
-          <w:rFonts w:eastAsia="Times New Roman"/>
-          <w:color w:val="000000"/>
-        </w:rPr>
-        <w:t xml:space="preserve">, </w:t>
-      </w:r>
-      <w:proofErr w:type="spellStart"/>
-      <w:r>
-        <w:rPr>
-          <w:rFonts w:eastAsia="Times New Roman"/>
-          <w:color w:val="000000"/>
-        </w:rPr>
-        <w:t>valor_ejecutado</w:t>
-      </w:r>
-      <w:proofErr w:type="spellEnd"/>
-      <w:r>
-        <w:rPr>
-          <w:rFonts w:eastAsia="Times New Roman"/>
-          <w:color w:val="000000"/>
-        </w:rPr>
-        <w:t xml:space="preserve">, </w:t>
-      </w:r>
-      <w:proofErr w:type="spellStart"/>
-      <w:r>
-        <w:rPr>
-          <w:rFonts w:eastAsia="Times New Roman"/>
-          <w:color w:val="000000"/>
-        </w:rPr>
-        <w:t>umbral_desviacion</w:t>
-      </w:r>
-      <w:proofErr w:type="spellEnd"/>
-      <w:r>
-        <w:rPr>
-          <w:rFonts w:eastAsia="Times New Roman"/>
-          <w:color w:val="000000"/>
-        </w:rPr>
-        <w:t>).</w:t>
-      </w:r>
-    </w:p>
-    <w:p>
-      <w:pPr>
-        <w:spacing w:before="0" w:line="240" w:lineRule="auto"/>
-        <w:ind w:left="0"/>
-        <w:rPr>
-          <w:rFonts w:ascii="Times New Roman" w:eastAsia="Times New Roman" w:hAnsi="Times New Roman" w:cs="Times New Roman"/>
-          <w:sz w:val="24"/>
-          <w:szCs w:val="24"/>
-        </w:rPr>
-      </w:pPr>
-    </w:p>
-    <w:p>
-      <w:pPr>
-        <w:spacing w:line="240" w:lineRule="auto"/>
-        <w:ind w:left="0"/>
-        <w:jc w:val="both"/>
-        <w:rPr>
-          <w:rFonts w:ascii="Times New Roman" w:eastAsia="Times New Roman" w:hAnsi="Times New Roman" w:cs="Times New Roman"/>
-          <w:sz w:val="24"/>
-          <w:szCs w:val="24"/>
-        </w:rPr>
-      </w:pPr>
-      <w:r>
-        <w:rPr>
-          <w:rFonts w:eastAsia="Times New Roman"/>
-          <w:b/>
-          <w:bCs/>
-          <w:color w:val="4F81BD"/>
-        </w:rPr>
-        <w:t>MODELO_CALIDAD-METRICA (N:M):</w:t>
-      </w:r>
-    </w:p>
-    <w:p>
-      <w:pPr>
-        <w:spacing w:line="240" w:lineRule="auto"/>
-        <w:ind w:left="0"/>
-        <w:jc w:val="both"/>
-        <w:rPr>
-          <w:rFonts w:ascii="Times New Roman" w:eastAsia="Times New Roman" w:hAnsi="Times New Roman" w:cs="Times New Roman"/>
-          <w:sz w:val="24"/>
-          <w:szCs w:val="24"/>
-        </w:rPr>
-      </w:pPr>
-      <w:r>
-        <w:rPr>
-          <w:rFonts w:eastAsia="Times New Roman"/>
-          <w:color w:val="000000"/>
-        </w:rPr>
-        <w:t>METRICA (</w:t>
-      </w:r>
-      <w:proofErr w:type="spellStart"/>
-      <w:r>
-        <w:rPr>
-          <w:rFonts w:eastAsia="Times New Roman"/>
-          <w:b/>
-          <w:bCs/>
-          <w:color w:val="000000"/>
-          <w:u w:val="single"/>
-        </w:rPr>
-        <w:t>id_metrica</w:t>
-      </w:r>
-      <w:proofErr w:type="spellEnd"/>
-      <w:r>
-        <w:rPr>
-          <w:rFonts w:eastAsia="Times New Roman"/>
-          <w:b/>
-          <w:bCs/>
-          <w:color w:val="000000"/>
-        </w:rPr>
-        <w:t>(PK)</w:t>
-      </w:r>
-      <w:r>
-        <w:rPr>
-          <w:rFonts w:eastAsia="Times New Roman"/>
-          <w:color w:val="000000"/>
-        </w:rPr>
-        <w:t xml:space="preserve">, nombre, </w:t>
-      </w:r>
-      <w:proofErr w:type="spellStart"/>
-      <w:r>
-        <w:rPr>
-          <w:rFonts w:eastAsia="Times New Roman"/>
-          <w:color w:val="000000"/>
-        </w:rPr>
-        <w:t>descripcion</w:t>
-      </w:r>
-      <w:proofErr w:type="spellEnd"/>
-      <w:r>
-        <w:rPr>
-          <w:rFonts w:eastAsia="Times New Roman"/>
-          <w:color w:val="000000"/>
-        </w:rPr>
-        <w:t>).</w:t>
-      </w:r>
-    </w:p>
-    <w:p>
-      <w:pPr>
-        <w:spacing w:line="240" w:lineRule="auto"/>
-        <w:ind w:left="0"/>
-        <w:jc w:val="both"/>
-        <w:rPr>
-          <w:rFonts w:ascii="Times New Roman" w:eastAsia="Times New Roman" w:hAnsi="Times New Roman" w:cs="Times New Roman"/>
-          <w:sz w:val="24"/>
-          <w:szCs w:val="24"/>
-        </w:rPr>
-      </w:pPr>
-      <w:r>
-        <w:rPr>
-          <w:rFonts w:eastAsia="Times New Roman"/>
-          <w:color w:val="000000"/>
-        </w:rPr>
-        <w:t>MODELO_CALIDAD (</w:t>
-      </w:r>
-      <w:proofErr w:type="spellStart"/>
-      <w:r>
-        <w:rPr>
-          <w:rFonts w:eastAsia="Times New Roman"/>
-          <w:b/>
-          <w:bCs/>
-          <w:color w:val="000000"/>
-          <w:u w:val="single"/>
-        </w:rPr>
-        <w:t>id_modelo</w:t>
-      </w:r>
-      <w:proofErr w:type="spellEnd"/>
-      <w:r>
-        <w:rPr>
-          <w:rFonts w:eastAsia="Times New Roman"/>
-          <w:b/>
-          <w:bCs/>
-          <w:color w:val="000000"/>
-        </w:rPr>
-        <w:t>(PK)</w:t>
-      </w:r>
-      <w:r>
-        <w:rPr>
-          <w:rFonts w:eastAsia="Times New Roman"/>
-          <w:color w:val="000000"/>
-        </w:rPr>
-        <w:t xml:space="preserve">, nombre, </w:t>
-      </w:r>
-      <w:proofErr w:type="spellStart"/>
-      <w:r>
-        <w:rPr>
-          <w:rFonts w:eastAsia="Times New Roman"/>
-          <w:color w:val="000000"/>
-        </w:rPr>
-        <w:t>descripcion</w:t>
-      </w:r>
-      <w:proofErr w:type="spellEnd"/>
-      <w:r>
-        <w:rPr>
-          <w:rFonts w:eastAsia="Times New Roman"/>
-          <w:color w:val="000000"/>
-        </w:rPr>
-        <w:t>).</w:t>
-      </w:r>
-    </w:p>
-    <w:p>
-      <w:pPr>
-        <w:spacing w:line="240" w:lineRule="auto"/>
-        <w:ind w:left="0"/>
-        <w:jc w:val="both"/>
-        <w:rPr>
-          <w:rFonts w:ascii="Times New Roman" w:eastAsia="Times New Roman" w:hAnsi="Times New Roman" w:cs="Times New Roman"/>
-          <w:sz w:val="24"/>
-          <w:szCs w:val="24"/>
-        </w:rPr>
-      </w:pPr>
-      <w:r>
-        <w:rPr>
-          <w:rFonts w:eastAsia="Times New Roman"/>
-          <w:color w:val="000000"/>
-        </w:rPr>
-        <w:t>METRICA_MODELO_CALIDAD (</w:t>
-      </w:r>
-      <w:proofErr w:type="spellStart"/>
-      <w:r>
-        <w:rPr>
-          <w:rFonts w:eastAsia="Times New Roman"/>
           <w:b/>
           <w:bCs/>
           <w:i/>
@@ -14771,9 +14676,9 @@
           <w:color w:val="073763"/>
           <w:u w:val="single"/>
         </w:rPr>
-        <w:t>id_metrica</w:t>
-      </w:r>
-      <w:proofErr w:type="spellEnd"/>
+        <w:t xml:space="preserve">, </w:t>
+      </w:r>
+      <w:proofErr w:type="spellStart"/>
       <w:r>
         <w:rPr>
           <w:rFonts w:eastAsia="Times New Roman"/>
@@ -14784,9 +14689,9 @@
           <w:color w:val="073763"/>
           <w:u w:val="single"/>
         </w:rPr>
-        <w:t xml:space="preserve">(FK), </w:t>
-      </w:r>
-      <w:proofErr w:type="spellStart"/>
+        <w:t>id_iteracion</w:t>
+      </w:r>
+      <w:proofErr w:type="spellEnd"/>
       <w:r>
         <w:rPr>
           <w:rFonts w:eastAsia="Times New Roman"/>
@@ -14797,9 +14702,263 @@
           <w:color w:val="073763"/>
           <w:u w:val="single"/>
         </w:rPr>
+        <w:t>(FK)</w:t>
+      </w:r>
+      <w:r>
+        <w:rPr>
+          <w:rFonts w:eastAsia="Times New Roman"/>
+          <w:i/>
+          <w:iCs/>
+          <w:color w:val="000000"/>
+        </w:rPr>
+        <w:t>(</w:t>
+      </w:r>
+      <w:r>
+        <w:rPr>
+          <w:rFonts w:eastAsia="Times New Roman"/>
+          <w:b/>
+          <w:bCs/>
+          <w:i/>
+          <w:iCs/>
+          <w:color w:val="000000"/>
+        </w:rPr>
+        <w:t>PK)</w:t>
+      </w:r>
+      <w:r>
+        <w:rPr>
+          <w:rFonts w:eastAsia="Times New Roman"/>
+          <w:i/>
+          <w:iCs/>
+          <w:color w:val="000000"/>
+        </w:rPr>
+        <w:t xml:space="preserve">, </w:t>
+      </w:r>
+      <w:proofErr w:type="spellStart"/>
+      <w:r>
+        <w:rPr>
+          <w:rFonts w:eastAsia="Times New Roman"/>
+          <w:color w:val="000000"/>
+        </w:rPr>
+        <w:t>valor_planificado</w:t>
+      </w:r>
+      <w:proofErr w:type="spellEnd"/>
+      <w:r>
+        <w:rPr>
+          <w:rFonts w:eastAsia="Times New Roman"/>
+          <w:color w:val="000000"/>
+        </w:rPr>
+        <w:t xml:space="preserve">, </w:t>
+      </w:r>
+      <w:proofErr w:type="spellStart"/>
+      <w:r>
+        <w:rPr>
+          <w:rFonts w:eastAsia="Times New Roman"/>
+          <w:color w:val="000000"/>
+        </w:rPr>
+        <w:t>valor_ejecutado</w:t>
+      </w:r>
+      <w:proofErr w:type="spellEnd"/>
+      <w:r>
+        <w:rPr>
+          <w:rFonts w:eastAsia="Times New Roman"/>
+          <w:color w:val="000000"/>
+        </w:rPr>
+        <w:t xml:space="preserve">, </w:t>
+      </w:r>
+      <w:proofErr w:type="spellStart"/>
+      <w:r>
+        <w:rPr>
+          <w:rFonts w:eastAsia="Times New Roman"/>
+          <w:color w:val="000000"/>
+        </w:rPr>
+        <w:t>umbral_desviacion</w:t>
+      </w:r>
+      <w:proofErr w:type="spellEnd"/>
+      <w:r>
+        <w:rPr>
+          <w:rFonts w:eastAsia="Times New Roman"/>
+          <w:color w:val="000000"/>
+        </w:rPr>
+        <w:t>).</w:t>
+      </w:r>
+    </w:p>
+    <w:p>
+      <w:pPr>
+        <w:spacing w:before="0" w:line="240" w:lineRule="auto"/>
+        <w:ind w:left="0"/>
+        <w:rPr>
+          <w:rFonts w:ascii="Times New Roman" w:eastAsia="Times New Roman" w:hAnsi="Times New Roman" w:cs="Times New Roman"/>
+          <w:sz w:val="24"/>
+          <w:szCs w:val="24"/>
+        </w:rPr>
+      </w:pPr>
+    </w:p>
+    <w:p>
+      <w:pPr>
+        <w:spacing w:line="240" w:lineRule="auto"/>
+        <w:ind w:left="0"/>
+        <w:jc w:val="both"/>
+        <w:rPr>
+          <w:rFonts w:ascii="Times New Roman" w:eastAsia="Times New Roman" w:hAnsi="Times New Roman" w:cs="Times New Roman"/>
+          <w:sz w:val="24"/>
+          <w:szCs w:val="24"/>
+        </w:rPr>
+      </w:pPr>
+      <w:r>
+        <w:rPr>
+          <w:rFonts w:eastAsia="Times New Roman"/>
+          <w:b/>
+          <w:bCs/>
+          <w:color w:val="4F81BD"/>
+        </w:rPr>
+        <w:t>MODELO_CALIDAD-METRICA (N:M):</w:t>
+      </w:r>
+    </w:p>
+    <w:p>
+      <w:pPr>
+        <w:spacing w:line="240" w:lineRule="auto"/>
+        <w:ind w:left="0"/>
+        <w:jc w:val="both"/>
+        <w:rPr>
+          <w:rFonts w:ascii="Times New Roman" w:eastAsia="Times New Roman" w:hAnsi="Times New Roman" w:cs="Times New Roman"/>
+          <w:sz w:val="24"/>
+          <w:szCs w:val="24"/>
+        </w:rPr>
+      </w:pPr>
+      <w:r>
+        <w:rPr>
+          <w:rFonts w:eastAsia="Times New Roman"/>
+          <w:color w:val="000000"/>
+        </w:rPr>
+        <w:t>METRICA (</w:t>
+      </w:r>
+      <w:proofErr w:type="spellStart"/>
+      <w:r>
+        <w:rPr>
+          <w:rFonts w:eastAsia="Times New Roman"/>
+          <w:b/>
+          <w:bCs/>
+          <w:color w:val="000000"/>
+          <w:u w:val="single"/>
+        </w:rPr>
+        <w:t>id_metrica</w:t>
+      </w:r>
+      <w:proofErr w:type="spellEnd"/>
+      <w:r>
+        <w:rPr>
+          <w:rFonts w:eastAsia="Times New Roman"/>
+          <w:b/>
+          <w:bCs/>
+          <w:color w:val="000000"/>
+        </w:rPr>
+        <w:t>(PK)</w:t>
+      </w:r>
+      <w:r>
+        <w:rPr>
+          <w:rFonts w:eastAsia="Times New Roman"/>
+          <w:color w:val="000000"/>
+        </w:rPr>
+        <w:t xml:space="preserve">, nombre, </w:t>
+      </w:r>
+      <w:proofErr w:type="spellStart"/>
+      <w:r>
+        <w:rPr>
+          <w:rFonts w:eastAsia="Times New Roman"/>
+          <w:color w:val="000000"/>
+        </w:rPr>
+        <w:t>descripcion</w:t>
+      </w:r>
+      <w:proofErr w:type="spellEnd"/>
+      <w:r>
+        <w:rPr>
+          <w:rFonts w:eastAsia="Times New Roman"/>
+          <w:color w:val="000000"/>
+        </w:rPr>
+        <w:t>).</w:t>
+      </w:r>
+    </w:p>
+    <w:p>
+      <w:pPr>
+        <w:spacing w:line="240" w:lineRule="auto"/>
+        <w:ind w:left="0"/>
+        <w:jc w:val="both"/>
+        <w:rPr>
+          <w:rFonts w:ascii="Times New Roman" w:eastAsia="Times New Roman" w:hAnsi="Times New Roman" w:cs="Times New Roman"/>
+          <w:sz w:val="24"/>
+          <w:szCs w:val="24"/>
+        </w:rPr>
+      </w:pPr>
+      <w:r>
+        <w:rPr>
+          <w:rFonts w:eastAsia="Times New Roman"/>
+          <w:color w:val="000000"/>
+        </w:rPr>
+        <w:t>MODELO_CALIDAD (</w:t>
+      </w:r>
+      <w:proofErr w:type="spellStart"/>
+      <w:r>
+        <w:rPr>
+          <w:rFonts w:eastAsia="Times New Roman"/>
+          <w:b/>
+          <w:bCs/>
+          <w:color w:val="000000"/>
+          <w:u w:val="single"/>
+        </w:rPr>
         <w:t>id_modelo</w:t>
       </w:r>
       <w:proofErr w:type="spellEnd"/>
+      <w:r>
+        <w:rPr>
+          <w:rFonts w:eastAsia="Times New Roman"/>
+          <w:b/>
+          <w:bCs/>
+          <w:color w:val="000000"/>
+        </w:rPr>
+        <w:t>(PK)</w:t>
+      </w:r>
+      <w:r>
+        <w:rPr>
+          <w:rFonts w:eastAsia="Times New Roman"/>
+          <w:color w:val="000000"/>
+        </w:rPr>
+        <w:t xml:space="preserve">, nombre, </w:t>
+      </w:r>
+      <w:proofErr w:type="spellStart"/>
+      <w:r>
+        <w:rPr>
+          <w:rFonts w:eastAsia="Times New Roman"/>
+          <w:color w:val="000000"/>
+        </w:rPr>
+        <w:t>descripcion</w:t>
+      </w:r>
+      <w:proofErr w:type="spellEnd"/>
+      <w:r>
+        <w:rPr>
+          <w:rFonts w:eastAsia="Times New Roman"/>
+          <w:color w:val="000000"/>
+        </w:rPr>
+        <w:t>).</w:t>
+      </w:r>
+    </w:p>
+    <w:p>
+      <w:pPr>
+        <w:spacing w:line="240" w:lineRule="auto"/>
+        <w:ind w:left="0"/>
+        <w:jc w:val="both"/>
+        <w:rPr>
+          <w:rFonts w:ascii="Times New Roman" w:eastAsia="Times New Roman" w:hAnsi="Times New Roman" w:cs="Times New Roman"/>
+          <w:sz w:val="24"/>
+          <w:szCs w:val="24"/>
+        </w:rPr>
+      </w:pPr>
+      <w:r>
+        <w:rPr>
+          <w:rFonts w:eastAsia="Times New Roman"/>
+          <w:color w:val="000000"/>
+        </w:rPr>
+        <w:t>METRICA_MODELO_CALIDAD (</w:t>
+      </w:r>
+      <w:proofErr w:type="spellStart"/>
       <w:r>
         <w:rPr>
           <w:rFonts w:eastAsia="Times New Roman"/>
@@ -14810,6 +14969,45 @@
           <w:color w:val="073763"/>
           <w:u w:val="single"/>
         </w:rPr>
+        <w:t>id_metrica</w:t>
+      </w:r>
+      <w:proofErr w:type="spellEnd"/>
+      <w:r>
+        <w:rPr>
+          <w:rFonts w:eastAsia="Times New Roman"/>
+          <w:b/>
+          <w:bCs/>
+          <w:i/>
+          <w:iCs/>
+          <w:color w:val="073763"/>
+          <w:u w:val="single"/>
+        </w:rPr>
+        <w:t xml:space="preserve">(FK), </w:t>
+      </w:r>
+      <w:proofErr w:type="spellStart"/>
+      <w:r>
+        <w:rPr>
+          <w:rFonts w:eastAsia="Times New Roman"/>
+          <w:b/>
+          <w:bCs/>
+          <w:i/>
+          <w:iCs/>
+          <w:color w:val="073763"/>
+          <w:u w:val="single"/>
+        </w:rPr>
+        <w:t>id_modelo</w:t>
+      </w:r>
+      <w:proofErr w:type="spellEnd"/>
+      <w:r>
+        <w:rPr>
+          <w:rFonts w:eastAsia="Times New Roman"/>
+          <w:b/>
+          <w:bCs/>
+          <w:i/>
+          <w:iCs/>
+          <w:color w:val="073763"/>
+          <w:u w:val="single"/>
+        </w:rPr>
         <w:t>(FK)</w:t>
       </w:r>
       <w:r>
@@ -15607,9 +15805,9 @@
         </w:rPr>
         <w:lastRenderedPageBreak/>
         <w:drawing>
-          <wp:inline distT="0" distB="0" distL="0" distR="0" wp14:anchorId="52FABB6B" wp14:editId="77F4DC32">
-            <wp:extent cx="5398770" cy="6934835"/>
-            <wp:effectExtent l="0" t="0" r="0" b="0"/>
+          <wp:inline distT="0" distB="0" distL="0" distR="0" wp14:anchorId="52FABB6B" wp14:editId="66BB429A">
+            <wp:extent cx="5398770" cy="6928091"/>
+            <wp:effectExtent l="0" t="0" r="0" b="6350"/>
             <wp:docPr id="15" name="Imagen 15"/>
             <wp:cNvGraphicFramePr>
               <a:graphicFrameLocks xmlns:a="http://schemas.openxmlformats.org/drawingml/2006/main" noChangeAspect="1"/>
@@ -15618,7 +15816,7 @@
               <a:graphicData uri="http://schemas.openxmlformats.org/drawingml/2006/picture">
                 <pic:pic xmlns:pic="http://schemas.openxmlformats.org/drawingml/2006/picture">
                   <pic:nvPicPr>
-                    <pic:cNvPr id="0" name="Picture 15"/>
+                    <pic:cNvPr id="15" name="Imagen 15"/>
                     <pic:cNvPicPr>
                       <a:picLocks noChangeAspect="1" noChangeArrowheads="1"/>
                     </pic:cNvPicPr>
@@ -15631,7 +15829,6 @@
                         </a:ext>
                       </a:extLst>
                     </a:blip>
-                    <a:srcRect/>
                     <a:stretch>
                       <a:fillRect/>
                     </a:stretch>
@@ -15639,7 +15836,7 @@
                   <pic:spPr bwMode="auto">
                     <a:xfrm>
                       <a:off x="0" y="0"/>
-                      <a:ext cx="5398770" cy="6934835"/>
+                      <a:ext cx="5398770" cy="6928091"/>
                     </a:xfrm>
                     <a:prstGeom prst="rect">
                       <a:avLst/>
@@ -16078,7 +16275,16 @@
           <w:bCs/>
           <w:color w:val="4F81BD"/>
         </w:rPr>
-        <w:t>METRICA_TAREA </w:t>
+        <w:t>METRICA_TAREA</w:t>
+      </w:r>
+      <w:r>
+        <w:rPr>
+          <w:rFonts w:eastAsia="Times New Roman"/>
+          <w:b/>
+          <w:bCs/>
+          <w:color w:val="4F81BD"/>
+        </w:rPr>
+        <w:t>_ITERACION</w:t>
       </w:r>
     </w:p>
     <w:p>
@@ -16115,6 +16321,22 @@
           <w:color w:val="000000"/>
         </w:rPr>
         <w:t>id_tarea</w:t>
+      </w:r>
+      <w:proofErr w:type="spellEnd"/>
+      <w:r>
+        <w:rPr>
+          <w:rFonts w:eastAsia="Times New Roman"/>
+          <w:color w:val="000000"/>
+        </w:rPr>
+        <w:t xml:space="preserve">, </w:t>
+      </w:r>
+      <w:proofErr w:type="spellStart"/>
+      <w:r>
+        <w:rPr>
+          <w:rFonts w:eastAsia="Times New Roman"/>
+          <w:color w:val="000000"/>
+        </w:rPr>
+        <w:t>id_iteracion</w:t>
       </w:r>
       <w:r>
         <w:rPr>
@@ -17221,7 +17443,7 @@
       <w:pPr>
         <w:spacing w:before="240" w:line="240" w:lineRule="auto"/>
         <w:ind w:left="0"/>
-        <w:jc w:val="both"/>
+        <w:jc w:val="center"/>
         <w:rPr>
           <w:rFonts w:ascii="Times New Roman" w:eastAsia="Times New Roman" w:hAnsi="Times New Roman" w:cs="Times New Roman"/>
           <w:sz w:val="24"/>
@@ -17230,17 +17452,16 @@
       </w:pPr>
       <w:r>
         <w:rPr>
-          <w:rFonts w:eastAsia="Times New Roman"/>
+          <w:rFonts w:ascii="Times New Roman" w:eastAsia="Times New Roman" w:hAnsi="Times New Roman" w:cs="Times New Roman"/>
           <w:noProof/>
-          <w:color w:val="000000"/>
-          <w:bdr w:val="none" w:sz="0" w:space="0" w:color="auto" w:frame="1"/>
-          <w:shd w:val="clear" w:color="auto" w:fill="FFFF00"/>
+          <w:sz w:val="24"/>
+          <w:szCs w:val="24"/>
         </w:rPr>
         <w:drawing>
-          <wp:inline distT="0" distB="0" distL="0" distR="0" wp14:anchorId="07B072B0" wp14:editId="7DB0EBC9">
-            <wp:extent cx="6305550" cy="3255010"/>
-            <wp:effectExtent l="0" t="0" r="0" b="2540"/>
-            <wp:docPr id="16" name="Imagen 16"/>
+          <wp:inline distT="0" distB="0" distL="0" distR="0" wp14:anchorId="316DE9BF" wp14:editId="37DBFE3A">
+            <wp:extent cx="6309360" cy="3470000"/>
+            <wp:effectExtent l="0" t="0" r="0" b="0"/>
+            <wp:docPr id="22" name="Imagen 22"/>
             <wp:cNvGraphicFramePr>
               <a:graphicFrameLocks xmlns:a="http://schemas.openxmlformats.org/drawingml/2006/main" noChangeAspect="1"/>
             </wp:cNvGraphicFramePr>
@@ -17248,10 +17469,8 @@
               <a:graphicData uri="http://schemas.openxmlformats.org/drawingml/2006/picture">
                 <pic:pic xmlns:pic="http://schemas.openxmlformats.org/drawingml/2006/picture">
                   <pic:nvPicPr>
-                    <pic:cNvPr id="0" name="Picture 16"/>
-                    <pic:cNvPicPr>
-                      <a:picLocks noChangeAspect="1" noChangeArrowheads="1"/>
-                    </pic:cNvPicPr>
+                    <pic:cNvPr id="22" name="Imagen 22"/>
+                    <pic:cNvPicPr/>
                   </pic:nvPicPr>
                   <pic:blipFill>
                     <a:blip r:embed="rId14" cstate="print">
@@ -17261,23 +17480,18 @@
                         </a:ext>
                       </a:extLst>
                     </a:blip>
-                    <a:srcRect/>
                     <a:stretch>
                       <a:fillRect/>
                     </a:stretch>
                   </pic:blipFill>
-                  <pic:spPr bwMode="auto">
+                  <pic:spPr>
                     <a:xfrm>
                       <a:off x="0" y="0"/>
-                      <a:ext cx="6305550" cy="3255010"/>
+                      <a:ext cx="6328403" cy="3480473"/>
                     </a:xfrm>
                     <a:prstGeom prst="rect">
                       <a:avLst/>
                     </a:prstGeom>
-                    <a:noFill/>
-                    <a:ln>
-                      <a:noFill/>
-                    </a:ln>
                   </pic:spPr>
                 </pic:pic>
               </a:graphicData>
@@ -17486,7 +17700,7 @@
                       </a:xfrm>
                     </wpg:grpSpPr>
                     <wpg:grpSp>
-                      <wpg:cNvPr id="15" name="Grupo 10"/>
+                      <wpg:cNvPr id="7" name="Grupo 10"/>
                       <wpg:cNvGrpSpPr/>
                       <wpg:grpSpPr>
                         <a:xfrm>
@@ -17497,7 +17711,7 @@
                         </a:xfrm>
                       </wpg:grpSpPr>
                       <wps:wsp>
-                        <wps:cNvPr id="16" name="Rectángulo 11"/>
+                        <wps:cNvPr id="8" name="Rectángulo 11"/>
                         <wps:cNvSpPr/>
                         <wps:spPr>
                           <a:xfrm>
@@ -17634,9 +17848,9 @@
         </mc:Choice>
         <mc:Fallback>
           <w:pict>
-            <v:group w14:anchorId="034BEE5F" id="Grupo 73" o:spid="_x0000_s1044" style="position:absolute;left:0;text-align:left;margin-left:-84.75pt;margin-top:-.05pt;width:594pt;height:63.75pt;z-index:251663360" coordorigin="15741,33751" coordsize="75438,8096" o:gfxdata="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">
-              <v:group id="Grupo 10" o:spid="_x0000_s1045" style="position:absolute;left:15741;top:33751;width:75438;height:8097" coordorigin="15760,33751" coordsize="75400,8096" o:gfxdata="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">
-                <v:rect id="Rectángulo 11" o:spid="_x0000_s1046" style="position:absolute;left:15760;top:33751;width:75400;height:8097;visibility:visible;mso-wrap-style:square;v-text-anchor:middle" o:gfxdata="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" filled="f" stroked="f">
+            <v:group w14:anchorId="034BEE5F" id="Grupo 73" o:spid="_x0000_s1044" style="position:absolute;left:0;text-align:left;margin-left:-84.75pt;margin-top:-.05pt;width:594pt;height:63.75pt;z-index:251663360" coordorigin="15741,33751" coordsize="75438,8096" o:gfxdata="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">
+              <v:group id="Grupo 10" o:spid="_x0000_s1045" style="position:absolute;left:15741;top:33751;width:75438;height:8097" coordorigin="15760,33751" coordsize="75400,8096" o:gfxdata="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">
+                <v:rect id="Rectángulo 11" o:spid="_x0000_s1046" style="position:absolute;left:15760;top:33751;width:75400;height:8097;visibility:visible;mso-wrap-style:square;v-text-anchor:middle" o:gfxdata="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" filled="f" stroked="f">
                   <v:textbox inset="2.53958mm,2.53958mm,2.53958mm,2.53958mm">
                     <w:txbxContent>
                       <w:p>
@@ -18042,7 +18256,7 @@
                           </wps:bodyPr>
                         </wps:wsp>
                         <wps:wsp>
-                          <wps:cNvPr id="13" name="Conector recto de flecha 8"/>
+                          <wps:cNvPr id="5" name="Conector recto de flecha 8"/>
                           <wps:cNvCnPr/>
                           <wps:spPr>
                             <a:xfrm>
@@ -18066,7 +18280,7 @@
                           <wps:bodyPr/>
                         </wps:wsp>
                         <wps:wsp>
-                          <wps:cNvPr id="14" name="Rectángulo 9"/>
+                          <wps:cNvPr id="6" name="Rectángulo 9"/>
                           <wps:cNvSpPr/>
                           <wps:spPr>
                             <a:xfrm>
@@ -18106,7 +18320,7 @@
         </mc:Choice>
         <mc:Fallback>
           <w:pict>
-            <v:group w14:anchorId="56E246F8" id="Grupo 65" o:spid="_x0000_s1035" style="position:absolute;margin-left:1pt;margin-top:1.5pt;width:593.25pt;height:63pt;z-index:251658240;mso-position-horizontal-relative:page;mso-position-vertical-relative:page" coordorigin="15788,33799" coordsize="75343,8001" o:gfxdata="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">
+            <v:group w14:anchorId="56E246F8" id="Grupo 65" o:spid="_x0000_s1035" style="position:absolute;margin-left:1pt;margin-top:1.5pt;width:593.25pt;height:63pt;z-index:251658240;mso-position-horizontal-relative:page;mso-position-vertical-relative:page" coordorigin="15788,33799" coordsize="75343,8001" o:gfxdata="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">
               <v:group id="Grupo 4" o:spid="_x0000_s1036" style="position:absolute;left:15788;top:33799;width:75343;height:8001" coordorigin="15772,33723" coordsize="75374,8153" o:gfxdata="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">
                 <v:rect id="Rectángulo 5" o:spid="_x0000_s1037" style="position:absolute;left:15772;top:33723;width:75375;height:8153;visibility:visible;mso-wrap-style:square;v-text-anchor:middle" o:gfxdata="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" filled="f" stroked="f">
                   <v:textbox inset="2.53958mm,2.53958mm,2.53958mm,2.53958mm">
@@ -18139,10 +18353,10 @@
                     <v:path arrowok="t" fillok="f" o:connecttype="none"/>
                     <o:lock v:ext="edit" shapetype="t"/>
                   </v:shapetype>
-                  <v:shape id="Conector recto de flecha 8" o:spid="_x0000_s1040" type="#_x0000_t32" style="position:absolute;left:9;top:1431;width:15822;height:0;visibility:visible;mso-wrap-style:square" o:connectortype="straight" o:gfxdata="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" strokecolor="#31849b">
+                  <v:shape id="Conector recto de flecha 8" o:spid="_x0000_s1040" type="#_x0000_t32" style="position:absolute;left:9;top:1431;width:15822;height:0;visibility:visible;mso-wrap-style:square" o:connectortype="straight" o:gfxdata="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" strokecolor="#31849b">
                     <v:stroke startarrowwidth="narrow" startarrowlength="short" endarrowwidth="narrow" endarrowlength="short"/>
                   </v:shape>
-                  <v:rect id="Rectángulo 9" o:spid="_x0000_s1041" style="position:absolute;left:8;top:9;width:4031;height:1439;visibility:visible;mso-wrap-style:square;v-text-anchor:middle" o:gfxdata="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" filled="f" stroked="f">
+                  <v:rect id="Rectángulo 9" o:spid="_x0000_s1041" style="position:absolute;left:8;top:9;width:4031;height:1439;visibility:visible;mso-wrap-style:square;v-text-anchor:middle" o:gfxdata="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" filled="f" stroked="f">
                     <v:textbox inset="2.53958mm,2.53958mm,2.53958mm,2.53958mm">
                       <w:txbxContent>
                         <w:p>
@@ -22276,6 +22490,7 @@
   <w:style w:type="character" w:default="1" w:styleId="Fuentedeprrafopredeter">
     <w:name w:val="Default Paragraph Font"/>
     <w:uiPriority w:val="1"/>
+    <w:semiHidden/>
     <w:unhideWhenUsed/>
   </w:style>
   <w:style w:type="table" w:default="1" w:styleId="Tablanormal">

</xml_diff>